<commit_message>
Refresh patched frontend tooling and verified final browser evidence
</commit_message>
<xml_diff>
--- a/docs/qa/commercial-docs-01b/final-fidelity/browser/professional-v3/part_request.docx
+++ b/docs/qa/commercial-docs-01b/final-fidelity/browser/professional-v3/part_request.docx
@@ -2056,386 +2056,7 @@
         </w:tblBorders>
       </w:tblPr>
       <w:tblGrid>
-        <w:gridCol w:w="2451"/>
-        <w:gridCol w:w="5862"/>
-        <w:gridCol w:w="2345"/>
-      </w:tblGrid>
-      <w:tr>
-        <w:trPr>
-          <w:trHeight w:val="1077" w:hRule="atLeast"/>
-          <w:cantSplit/>
-        </w:trPr>
-        <w:tc>
-          <w:tcPr>
-            <w:tcW w:type="dxa" w:w="2451"/>
-            <w:vAlign w:val="center"/>
-            <w:tcMar>
-              <w:top w:w="68" w:type="dxa"/>
-              <w:left w:w="68" w:type="dxa"/>
-              <w:bottom w:w="68" w:type="dxa"/>
-              <w:right w:w="68" w:type="dxa"/>
-            </w:tcMar>
-            <w:tcBorders>
-              <w:top w:val="single" w:sz="4" w:color="000000"/>
-              <w:left w:val="single" w:sz="4" w:color="000000"/>
-              <w:bottom w:val="single" w:sz="4" w:color="000000"/>
-              <w:right w:val="single" w:sz="4" w:color="000000"/>
-            </w:tcBorders>
-          </w:tcPr>
-          <w:p>
-            <w:pPr>
-              <w:keepNext/>
-              <w:widowControl/>
-              <w:spacing w:after="57"/>
-              <w:ind w:left="0" w:right="0"/>
-              <w:jc w:val="left"/>
-            </w:pPr>
-            <w:r>
-              <w:rPr>
-                <w:rFonts w:ascii="Arial" w:hAnsi="Arial" w:eastAsia="Arial" w:cs="Arial"/>
-                <w:b w:val="0"/>
-                <w:i w:val="0"/>
-                <w:color w:val="000000"/>
-                <w:sz w:val="18"/>
-              </w:rPr>
-              <w:t>Заявител</w:t>
-            </w:r>
-          </w:p>
-        </w:tc>
-        <w:tc>
-          <w:tcPr>
-            <w:tcW w:type="dxa" w:w="5862"/>
-            <w:vAlign w:val="center"/>
-            <w:tcMar>
-              <w:top w:w="68" w:type="dxa"/>
-              <w:left w:w="68" w:type="dxa"/>
-              <w:bottom w:w="68" w:type="dxa"/>
-              <w:right w:w="68" w:type="dxa"/>
-            </w:tcMar>
-            <w:tcBorders>
-              <w:top w:val="single" w:sz="4" w:color="000000"/>
-              <w:left w:val="single" w:sz="4" w:color="000000"/>
-              <w:bottom w:val="single" w:sz="4" w:color="000000"/>
-              <w:right w:val="single" w:sz="4" w:color="000000"/>
-            </w:tcBorders>
-          </w:tcPr>
-          <w:p>
-            <w:pPr>
-              <w:keepNext/>
-              <w:widowControl/>
-              <w:spacing w:after="57"/>
-              <w:ind w:left="0" w:right="0"/>
-              <w:jc w:val="left"/>
-            </w:pPr>
-            <w:r>
-              <w:rPr>
-                <w:rFonts w:ascii="Arial" w:hAnsi="Arial" w:eastAsia="Arial" w:cs="Arial"/>
-                <w:b w:val="0"/>
-                <w:i w:val="0"/>
-                <w:color w:val="000000"/>
-                <w:sz w:val="18"/>
-              </w:rPr>
-              <w:t>Синтетична проверка · LEFT_SIGNER_NAME</w:t>
-            </w:r>
-          </w:p>
-          <w:p>
-            <w:pPr>
-              <w:keepNext/>
-              <w:widowControl/>
-              <w:spacing w:after="57"/>
-              <w:ind w:left="0" w:right="0"/>
-              <w:jc w:val="left"/>
-            </w:pPr>
-            <w:r>
-              <w:rPr>
-                <w:rFonts w:ascii="Arial" w:hAnsi="Arial" w:eastAsia="Arial" w:cs="Arial"/>
-                <w:b w:val="0"/>
-                <w:i w:val="0"/>
-                <w:color w:val="000000"/>
-                <w:sz w:val="18"/>
-              </w:rPr>
-              <w:t>Синтетична проверка · LEFT_SIGNER_JOB_TITLE</w:t>
-            </w:r>
-          </w:p>
-          <w:p>
-            <w:pPr>
-              <w:keepNext/>
-              <w:widowControl/>
-              <w:spacing w:after="57"/>
-              <w:ind w:left="0" w:right="0"/>
-              <w:jc w:val="left"/>
-            </w:pPr>
-            <w:r>
-              <w:rPr>
-                <w:rFonts w:ascii="Arial" w:hAnsi="Arial" w:eastAsia="Arial" w:cs="Arial"/>
-                <w:b w:val="0"/>
-                <w:i w:val="0"/>
-                <w:color w:val="000000"/>
-                <w:sz w:val="18"/>
-              </w:rPr>
-              <w:t>Синтетична проверка · LEFT_SIGNER_ORGANIZATION</w:t>
-            </w:r>
-          </w:p>
-        </w:tc>
-        <w:tc>
-          <w:tcPr>
-            <w:tcW w:type="dxa" w:w="2345"/>
-            <w:vAlign w:val="center"/>
-            <w:tcMar>
-              <w:top w:w="68" w:type="dxa"/>
-              <w:left w:w="68" w:type="dxa"/>
-              <w:bottom w:w="68" w:type="dxa"/>
-              <w:right w:w="68" w:type="dxa"/>
-            </w:tcMar>
-            <w:tcBorders>
-              <w:top w:val="single" w:sz="4" w:color="000000"/>
-              <w:left w:val="single" w:sz="4" w:color="000000"/>
-              <w:bottom w:val="single" w:sz="4" w:color="000000"/>
-              <w:right w:val="single" w:sz="4" w:color="000000"/>
-            </w:tcBorders>
-          </w:tcPr>
-          <w:p>
-            <w:pPr>
-              <w:keepNext/>
-              <w:keepLines/>
-              <w:widowControl/>
-              <w:spacing w:after="0" w:before="0"/>
-              <w:ind w:left="0" w:right="0"/>
-              <w:jc w:val="left"/>
-            </w:pPr>
-            <w:r>
-              <w:rPr>
-                <w:rFonts w:ascii="Arial" w:hAnsi="Arial" w:eastAsia="Arial" w:cs="Arial"/>
-                <w:b w:val="0"/>
-                <w:i w:val="0"/>
-                <w:color w:val="000000"/>
-                <w:sz w:val="16"/>
-              </w:rPr>
-              <w:t>Подпис</w:t>
-            </w:r>
-          </w:p>
-          <w:p>
-            <w:pPr>
-              <w:keepNext/>
-              <w:keepLines/>
-              <w:widowControl/>
-              <w:spacing w:after="0"/>
-              <w:ind w:left="0" w:right="0"/>
-              <w:jc w:val="left"/>
-            </w:pPr>
-            <w:r>
-              <w:rPr>
-                <w:rFonts w:ascii="Arial" w:hAnsi="Arial" w:eastAsia="Arial" w:cs="Arial"/>
-                <w:b w:val="0"/>
-                <w:i w:val="0"/>
-                <w:color w:val="000000"/>
-                <w:sz w:val="16"/>
-              </w:rPr>
-              <w:t>________________</w:t>
-            </w:r>
-          </w:p>
-        </w:tc>
-      </w:tr>
-      <w:tr>
-        <w:trPr>
-          <w:trHeight w:val="1077" w:hRule="atLeast"/>
-          <w:cantSplit/>
-        </w:trPr>
-        <w:tc>
-          <w:tcPr>
-            <w:tcW w:type="dxa" w:w="2451"/>
-            <w:vAlign w:val="center"/>
-            <w:tcMar>
-              <w:top w:w="68" w:type="dxa"/>
-              <w:left w:w="68" w:type="dxa"/>
-              <w:bottom w:w="68" w:type="dxa"/>
-              <w:right w:w="68" w:type="dxa"/>
-            </w:tcMar>
-            <w:tcBorders>
-              <w:top w:val="single" w:sz="4" w:color="000000"/>
-              <w:left w:val="single" w:sz="4" w:color="000000"/>
-              <w:bottom w:val="single" w:sz="4" w:color="000000"/>
-              <w:right w:val="single" w:sz="4" w:color="000000"/>
-            </w:tcBorders>
-          </w:tcPr>
-          <w:p>
-            <w:pPr>
-              <w:widowControl/>
-              <w:spacing w:after="57"/>
-              <w:ind w:left="0" w:right="0"/>
-              <w:jc w:val="left"/>
-            </w:pPr>
-            <w:r>
-              <w:rPr>
-                <w:rFonts w:ascii="Arial" w:hAnsi="Arial" w:eastAsia="Arial" w:cs="Arial"/>
-                <w:b w:val="0"/>
-                <w:i w:val="0"/>
-                <w:color w:val="000000"/>
-                <w:sz w:val="18"/>
-              </w:rPr>
-              <w:t>Одобрил заявката</w:t>
-            </w:r>
-          </w:p>
-        </w:tc>
-        <w:tc>
-          <w:tcPr>
-            <w:tcW w:type="dxa" w:w="5862"/>
-            <w:vAlign w:val="center"/>
-            <w:tcMar>
-              <w:top w:w="68" w:type="dxa"/>
-              <w:left w:w="68" w:type="dxa"/>
-              <w:bottom w:w="68" w:type="dxa"/>
-              <w:right w:w="68" w:type="dxa"/>
-            </w:tcMar>
-            <w:tcBorders>
-              <w:top w:val="single" w:sz="4" w:color="000000"/>
-              <w:left w:val="single" w:sz="4" w:color="000000"/>
-              <w:bottom w:val="single" w:sz="4" w:color="000000"/>
-              <w:right w:val="single" w:sz="4" w:color="000000"/>
-            </w:tcBorders>
-          </w:tcPr>
-          <w:p>
-            <w:pPr>
-              <w:widowControl/>
-              <w:spacing w:after="57"/>
-              <w:ind w:left="0" w:right="0"/>
-              <w:jc w:val="left"/>
-            </w:pPr>
-            <w:r>
-              <w:rPr>
-                <w:rFonts w:ascii="Arial" w:hAnsi="Arial" w:eastAsia="Arial" w:cs="Arial"/>
-                <w:b w:val="0"/>
-                <w:i w:val="0"/>
-                <w:color w:val="000000"/>
-                <w:sz w:val="18"/>
-              </w:rPr>
-              <w:t>Синтетична проверка · RIGHT_SIGNER_NAME</w:t>
-            </w:r>
-          </w:p>
-          <w:p>
-            <w:pPr>
-              <w:widowControl/>
-              <w:spacing w:after="57"/>
-              <w:ind w:left="0" w:right="0"/>
-              <w:jc w:val="left"/>
-            </w:pPr>
-            <w:r>
-              <w:rPr>
-                <w:rFonts w:ascii="Arial" w:hAnsi="Arial" w:eastAsia="Arial" w:cs="Arial"/>
-                <w:b w:val="0"/>
-                <w:i w:val="0"/>
-                <w:color w:val="000000"/>
-                <w:sz w:val="18"/>
-              </w:rPr>
-              <w:t>Синтетична проверка · RIGHT_SIGNER_JOB_TITLE</w:t>
-            </w:r>
-          </w:p>
-          <w:p>
-            <w:pPr>
-              <w:widowControl/>
-              <w:spacing w:after="57"/>
-              <w:ind w:left="0" w:right="0"/>
-              <w:jc w:val="left"/>
-            </w:pPr>
-            <w:r>
-              <w:rPr>
-                <w:rFonts w:ascii="Arial" w:hAnsi="Arial" w:eastAsia="Arial" w:cs="Arial"/>
-                <w:b w:val="0"/>
-                <w:i w:val="0"/>
-                <w:color w:val="000000"/>
-                <w:sz w:val="18"/>
-              </w:rPr>
-              <w:t>Синтетична проверка · RIGHT_SIGNER_ORGANIZATION</w:t>
-            </w:r>
-          </w:p>
-        </w:tc>
-        <w:tc>
-          <w:tcPr>
-            <w:tcW w:type="dxa" w:w="2345"/>
-            <w:vAlign w:val="center"/>
-            <w:tcMar>
-              <w:top w:w="68" w:type="dxa"/>
-              <w:left w:w="68" w:type="dxa"/>
-              <w:bottom w:w="68" w:type="dxa"/>
-              <w:right w:w="68" w:type="dxa"/>
-            </w:tcMar>
-            <w:tcBorders>
-              <w:top w:val="single" w:sz="4" w:color="000000"/>
-              <w:left w:val="single" w:sz="4" w:color="000000"/>
-              <w:bottom w:val="single" w:sz="4" w:color="000000"/>
-              <w:right w:val="single" w:sz="4" w:color="000000"/>
-            </w:tcBorders>
-          </w:tcPr>
-          <w:p>
-            <w:pPr>
-              <w:keepNext/>
-              <w:keepLines/>
-              <w:widowControl/>
-              <w:spacing w:after="0" w:before="0"/>
-              <w:ind w:left="0" w:right="0"/>
-              <w:jc w:val="left"/>
-            </w:pPr>
-            <w:r>
-              <w:rPr>
-                <w:rFonts w:ascii="Arial" w:hAnsi="Arial" w:eastAsia="Arial" w:cs="Arial"/>
-                <w:b w:val="0"/>
-                <w:i w:val="0"/>
-                <w:color w:val="000000"/>
-                <w:sz w:val="16"/>
-              </w:rPr>
-              <w:t>Подпис</w:t>
-            </w:r>
-          </w:p>
-          <w:p>
-            <w:pPr>
-              <w:keepLines/>
-              <w:widowControl/>
-              <w:spacing w:after="0"/>
-              <w:ind w:left="0" w:right="0"/>
-              <w:jc w:val="left"/>
-            </w:pPr>
-            <w:r>
-              <w:rPr>
-                <w:rFonts w:ascii="Arial" w:hAnsi="Arial" w:eastAsia="Arial" w:cs="Arial"/>
-                <w:b w:val="0"/>
-                <w:i w:val="0"/>
-                <w:color w:val="000000"/>
-                <w:sz w:val="16"/>
-              </w:rPr>
-              <w:t>________________</w:t>
-            </w:r>
-          </w:p>
-        </w:tc>
-      </w:tr>
-    </w:tbl>
-    <w:p>
-      <w:pPr>
-        <w:spacing w:after="57" w:before="0" w:line="20" w:lineRule="exact"/>
-      </w:pPr>
-      <w:r>
-        <w:rPr>
-          <w:sz w:val="2"/>
-        </w:rPr>
-      </w:r>
-    </w:p>
-    <w:tbl>
-      <w:tblPr>
-        <w:tblW w:type="auto" w:w="0"/>
-        <w:jc w:val="left"/>
-        <w:tblLayout w:type="fixed"/>
-        <w:tblLook w:firstColumn="1" w:firstRow="1" w:lastColumn="0" w:lastRow="0" w:noHBand="0" w:noVBand="1" w:val="04A0"/>
-        <w:tblBorders>
-          <w:top w:val="nil" w:sz="1" w:color="000000"/>
-          <w:left w:val="nil" w:sz="1" w:color="000000"/>
-          <w:bottom w:val="nil" w:sz="1" w:color="000000"/>
-          <w:right w:val="nil" w:sz="1" w:color="000000"/>
-          <w:insideH w:val="nil" w:sz="1" w:color="000000"/>
-          <w:insideV w:val="nil" w:sz="1" w:color="000000"/>
-        </w:tblBorders>
-      </w:tblPr>
-      <w:tblGrid>
-        <w:gridCol w:w="6928"/>
-        <w:gridCol w:w="3730"/>
+        <w:gridCol w:w="10658"/>
       </w:tblGrid>
       <w:tr>
         <w:trPr>
@@ -2444,109 +2065,571 @@
         </w:trPr>
         <w:tc>
           <w:tcPr>
-            <w:tcW w:type="dxa" w:w="6928"/>
+            <w:tcW w:type="dxa" w:w="10658"/>
             <w:vAlign w:val="center"/>
             <w:tcMar>
-              <w:top w:w="68" w:type="dxa"/>
-              <w:left w:w="68" w:type="dxa"/>
-              <w:bottom w:w="68" w:type="dxa"/>
-              <w:right w:w="68" w:type="dxa"/>
+              <w:top w:w="0" w:type="dxa"/>
+              <w:left w:w="0" w:type="dxa"/>
+              <w:bottom w:w="0" w:type="dxa"/>
+              <w:right w:w="0" w:type="dxa"/>
             </w:tcMar>
             <w:tcBorders>
-              <w:top w:val="single" w:sz="4" w:color="000000"/>
-              <w:left w:val="single" w:sz="4" w:color="000000"/>
-              <w:bottom w:val="single" w:sz="4" w:color="000000"/>
-              <w:right w:val="single" w:sz="4" w:color="000000"/>
+              <w:top w:val="nil" w:sz="1" w:color="183153"/>
+              <w:left w:val="nil" w:sz="1" w:color="183153"/>
+              <w:bottom w:val="nil" w:sz="1" w:color="183153"/>
+              <w:right w:val="nil" w:sz="1" w:color="183153"/>
             </w:tcBorders>
           </w:tcPr>
+          <w:tbl>
+            <w:tblPr>
+              <w:tblW w:type="auto" w:w="0"/>
+              <w:jc w:val="left"/>
+              <w:tblLayout w:type="fixed"/>
+              <w:tblLook w:firstColumn="1" w:firstRow="1" w:lastColumn="0" w:lastRow="0" w:noHBand="0" w:noVBand="1" w:val="04A0"/>
+              <w:tblBorders>
+                <w:top w:val="nil" w:sz="1" w:color="000000"/>
+                <w:left w:val="nil" w:sz="1" w:color="000000"/>
+                <w:bottom w:val="nil" w:sz="1" w:color="000000"/>
+                <w:right w:val="nil" w:sz="1" w:color="000000"/>
+                <w:insideH w:val="nil" w:sz="1" w:color="000000"/>
+                <w:insideV w:val="nil" w:sz="1" w:color="000000"/>
+              </w:tblBorders>
+            </w:tblPr>
+            <w:tblGrid>
+              <w:gridCol w:w="2451"/>
+              <w:gridCol w:w="5862"/>
+              <w:gridCol w:w="2345"/>
+            </w:tblGrid>
+            <w:tr>
+              <w:trPr>
+                <w:trHeight w:val="1077" w:hRule="atLeast"/>
+                <w:cantSplit/>
+              </w:trPr>
+              <w:tc>
+                <w:tcPr>
+                  <w:tcW w:type="dxa" w:w="2451"/>
+                  <w:vAlign w:val="center"/>
+                  <w:tcMar>
+                    <w:top w:w="68" w:type="dxa"/>
+                    <w:left w:w="68" w:type="dxa"/>
+                    <w:bottom w:w="68" w:type="dxa"/>
+                    <w:right w:w="68" w:type="dxa"/>
+                  </w:tcMar>
+                  <w:tcBorders>
+                    <w:top w:val="single" w:sz="4" w:color="000000"/>
+                    <w:left w:val="single" w:sz="4" w:color="000000"/>
+                    <w:bottom w:val="single" w:sz="4" w:color="000000"/>
+                    <w:right w:val="single" w:sz="4" w:color="000000"/>
+                  </w:tcBorders>
+                </w:tcPr>
+                <w:p>
+                  <w:pPr>
+                    <w:keepNext/>
+                    <w:widowControl/>
+                    <w:spacing w:after="57"/>
+                    <w:ind w:left="0" w:right="0"/>
+                    <w:jc w:val="left"/>
+                  </w:pPr>
+                  <w:r>
+                    <w:rPr>
+                      <w:rFonts w:ascii="Arial" w:hAnsi="Arial" w:eastAsia="Arial" w:cs="Arial"/>
+                      <w:b w:val="0"/>
+                      <w:i w:val="0"/>
+                      <w:color w:val="000000"/>
+                      <w:sz w:val="18"/>
+                    </w:rPr>
+                    <w:t>Заявител</w:t>
+                  </w:r>
+                </w:p>
+              </w:tc>
+              <w:tc>
+                <w:tcPr>
+                  <w:tcW w:type="dxa" w:w="5862"/>
+                  <w:vAlign w:val="center"/>
+                  <w:tcMar>
+                    <w:top w:w="68" w:type="dxa"/>
+                    <w:left w:w="68" w:type="dxa"/>
+                    <w:bottom w:w="68" w:type="dxa"/>
+                    <w:right w:w="68" w:type="dxa"/>
+                  </w:tcMar>
+                  <w:tcBorders>
+                    <w:top w:val="single" w:sz="4" w:color="000000"/>
+                    <w:left w:val="single" w:sz="4" w:color="000000"/>
+                    <w:bottom w:val="single" w:sz="4" w:color="000000"/>
+                    <w:right w:val="single" w:sz="4" w:color="000000"/>
+                  </w:tcBorders>
+                </w:tcPr>
+                <w:p>
+                  <w:pPr>
+                    <w:keepNext/>
+                    <w:widowControl/>
+                    <w:spacing w:after="57"/>
+                    <w:ind w:left="0" w:right="0"/>
+                    <w:jc w:val="left"/>
+                  </w:pPr>
+                  <w:r>
+                    <w:rPr>
+                      <w:rFonts w:ascii="Arial" w:hAnsi="Arial" w:eastAsia="Arial" w:cs="Arial"/>
+                      <w:b w:val="0"/>
+                      <w:i w:val="0"/>
+                      <w:color w:val="000000"/>
+                      <w:sz w:val="18"/>
+                    </w:rPr>
+                    <w:t>Синтетична проверка · LEFT_SIGNER_NAME</w:t>
+                  </w:r>
+                </w:p>
+                <w:p>
+                  <w:pPr>
+                    <w:keepNext/>
+                    <w:widowControl/>
+                    <w:spacing w:after="57"/>
+                    <w:ind w:left="0" w:right="0"/>
+                    <w:jc w:val="left"/>
+                  </w:pPr>
+                  <w:r>
+                    <w:rPr>
+                      <w:rFonts w:ascii="Arial" w:hAnsi="Arial" w:eastAsia="Arial" w:cs="Arial"/>
+                      <w:b w:val="0"/>
+                      <w:i w:val="0"/>
+                      <w:color w:val="000000"/>
+                      <w:sz w:val="18"/>
+                    </w:rPr>
+                    <w:t>Синтетична проверка · LEFT_SIGNER_JOB_TITLE</w:t>
+                  </w:r>
+                </w:p>
+                <w:p>
+                  <w:pPr>
+                    <w:keepNext/>
+                    <w:widowControl/>
+                    <w:spacing w:after="57"/>
+                    <w:ind w:left="0" w:right="0"/>
+                    <w:jc w:val="left"/>
+                  </w:pPr>
+                  <w:r>
+                    <w:rPr>
+                      <w:rFonts w:ascii="Arial" w:hAnsi="Arial" w:eastAsia="Arial" w:cs="Arial"/>
+                      <w:b w:val="0"/>
+                      <w:i w:val="0"/>
+                      <w:color w:val="000000"/>
+                      <w:sz w:val="18"/>
+                    </w:rPr>
+                    <w:t>Синтетична проверка · LEFT_SIGNER_ORGANIZATION</w:t>
+                  </w:r>
+                </w:p>
+              </w:tc>
+              <w:tc>
+                <w:tcPr>
+                  <w:tcW w:type="dxa" w:w="2345"/>
+                  <w:vAlign w:val="center"/>
+                  <w:tcMar>
+                    <w:top w:w="68" w:type="dxa"/>
+                    <w:left w:w="68" w:type="dxa"/>
+                    <w:bottom w:w="68" w:type="dxa"/>
+                    <w:right w:w="68" w:type="dxa"/>
+                  </w:tcMar>
+                  <w:tcBorders>
+                    <w:top w:val="single" w:sz="4" w:color="000000"/>
+                    <w:left w:val="single" w:sz="4" w:color="000000"/>
+                    <w:bottom w:val="single" w:sz="4" w:color="000000"/>
+                    <w:right w:val="single" w:sz="4" w:color="000000"/>
+                  </w:tcBorders>
+                </w:tcPr>
+                <w:p>
+                  <w:pPr>
+                    <w:keepNext/>
+                    <w:keepLines/>
+                    <w:widowControl/>
+                    <w:spacing w:after="0" w:before="0"/>
+                    <w:ind w:left="0" w:right="0"/>
+                    <w:jc w:val="left"/>
+                  </w:pPr>
+                  <w:r>
+                    <w:rPr>
+                      <w:rFonts w:ascii="Arial" w:hAnsi="Arial" w:eastAsia="Arial" w:cs="Arial"/>
+                      <w:b w:val="0"/>
+                      <w:i w:val="0"/>
+                      <w:color w:val="000000"/>
+                      <w:sz w:val="16"/>
+                    </w:rPr>
+                    <w:t>Подпис</w:t>
+                  </w:r>
+                </w:p>
+                <w:p>
+                  <w:pPr>
+                    <w:keepNext/>
+                    <w:keepLines/>
+                    <w:widowControl/>
+                    <w:spacing w:after="0"/>
+                    <w:ind w:left="0" w:right="0"/>
+                    <w:jc w:val="left"/>
+                  </w:pPr>
+                  <w:r>
+                    <w:rPr>
+                      <w:rFonts w:ascii="Arial" w:hAnsi="Arial" w:eastAsia="Arial" w:cs="Arial"/>
+                      <w:b w:val="0"/>
+                      <w:i w:val="0"/>
+                      <w:color w:val="000000"/>
+                      <w:sz w:val="16"/>
+                    </w:rPr>
+                    <w:t>________________</w:t>
+                  </w:r>
+                </w:p>
+              </w:tc>
+            </w:tr>
+            <w:tr>
+              <w:trPr>
+                <w:trHeight w:val="1077" w:hRule="atLeast"/>
+                <w:cantSplit/>
+              </w:trPr>
+              <w:tc>
+                <w:tcPr>
+                  <w:tcW w:type="dxa" w:w="2451"/>
+                  <w:vAlign w:val="center"/>
+                  <w:tcMar>
+                    <w:top w:w="68" w:type="dxa"/>
+                    <w:left w:w="68" w:type="dxa"/>
+                    <w:bottom w:w="68" w:type="dxa"/>
+                    <w:right w:w="68" w:type="dxa"/>
+                  </w:tcMar>
+                  <w:tcBorders>
+                    <w:top w:val="single" w:sz="4" w:color="000000"/>
+                    <w:left w:val="single" w:sz="4" w:color="000000"/>
+                    <w:bottom w:val="single" w:sz="4" w:color="000000"/>
+                    <w:right w:val="single" w:sz="4" w:color="000000"/>
+                  </w:tcBorders>
+                </w:tcPr>
+                <w:p>
+                  <w:pPr>
+                    <w:widowControl/>
+                    <w:spacing w:after="57"/>
+                    <w:ind w:left="0" w:right="0"/>
+                    <w:jc w:val="left"/>
+                  </w:pPr>
+                  <w:r>
+                    <w:rPr>
+                      <w:rFonts w:ascii="Arial" w:hAnsi="Arial" w:eastAsia="Arial" w:cs="Arial"/>
+                      <w:b w:val="0"/>
+                      <w:i w:val="0"/>
+                      <w:color w:val="000000"/>
+                      <w:sz w:val="18"/>
+                    </w:rPr>
+                    <w:t>Одобрил заявката</w:t>
+                  </w:r>
+                </w:p>
+              </w:tc>
+              <w:tc>
+                <w:tcPr>
+                  <w:tcW w:type="dxa" w:w="5862"/>
+                  <w:vAlign w:val="center"/>
+                  <w:tcMar>
+                    <w:top w:w="68" w:type="dxa"/>
+                    <w:left w:w="68" w:type="dxa"/>
+                    <w:bottom w:w="68" w:type="dxa"/>
+                    <w:right w:w="68" w:type="dxa"/>
+                  </w:tcMar>
+                  <w:tcBorders>
+                    <w:top w:val="single" w:sz="4" w:color="000000"/>
+                    <w:left w:val="single" w:sz="4" w:color="000000"/>
+                    <w:bottom w:val="single" w:sz="4" w:color="000000"/>
+                    <w:right w:val="single" w:sz="4" w:color="000000"/>
+                  </w:tcBorders>
+                </w:tcPr>
+                <w:p>
+                  <w:pPr>
+                    <w:widowControl/>
+                    <w:spacing w:after="57"/>
+                    <w:ind w:left="0" w:right="0"/>
+                    <w:jc w:val="left"/>
+                  </w:pPr>
+                  <w:r>
+                    <w:rPr>
+                      <w:rFonts w:ascii="Arial" w:hAnsi="Arial" w:eastAsia="Arial" w:cs="Arial"/>
+                      <w:b w:val="0"/>
+                      <w:i w:val="0"/>
+                      <w:color w:val="000000"/>
+                      <w:sz w:val="18"/>
+                    </w:rPr>
+                    <w:t>Синтетична проверка · RIGHT_SIGNER_NAME</w:t>
+                  </w:r>
+                </w:p>
+                <w:p>
+                  <w:pPr>
+                    <w:widowControl/>
+                    <w:spacing w:after="57"/>
+                    <w:ind w:left="0" w:right="0"/>
+                    <w:jc w:val="left"/>
+                  </w:pPr>
+                  <w:r>
+                    <w:rPr>
+                      <w:rFonts w:ascii="Arial" w:hAnsi="Arial" w:eastAsia="Arial" w:cs="Arial"/>
+                      <w:b w:val="0"/>
+                      <w:i w:val="0"/>
+                      <w:color w:val="000000"/>
+                      <w:sz w:val="18"/>
+                    </w:rPr>
+                    <w:t>Синтетична проверка · RIGHT_SIGNER_JOB_TITLE</w:t>
+                  </w:r>
+                </w:p>
+                <w:p>
+                  <w:pPr>
+                    <w:widowControl/>
+                    <w:spacing w:after="57"/>
+                    <w:ind w:left="0" w:right="0"/>
+                    <w:jc w:val="left"/>
+                  </w:pPr>
+                  <w:r>
+                    <w:rPr>
+                      <w:rFonts w:ascii="Arial" w:hAnsi="Arial" w:eastAsia="Arial" w:cs="Arial"/>
+                      <w:b w:val="0"/>
+                      <w:i w:val="0"/>
+                      <w:color w:val="000000"/>
+                      <w:sz w:val="18"/>
+                    </w:rPr>
+                    <w:t>Синтетична проверка · RIGHT_SIGNER_ORGANIZATION</w:t>
+                  </w:r>
+                </w:p>
+              </w:tc>
+              <w:tc>
+                <w:tcPr>
+                  <w:tcW w:type="dxa" w:w="2345"/>
+                  <w:vAlign w:val="center"/>
+                  <w:tcMar>
+                    <w:top w:w="68" w:type="dxa"/>
+                    <w:left w:w="68" w:type="dxa"/>
+                    <w:bottom w:w="68" w:type="dxa"/>
+                    <w:right w:w="68" w:type="dxa"/>
+                  </w:tcMar>
+                  <w:tcBorders>
+                    <w:top w:val="single" w:sz="4" w:color="000000"/>
+                    <w:left w:val="single" w:sz="4" w:color="000000"/>
+                    <w:bottom w:val="single" w:sz="4" w:color="000000"/>
+                    <w:right w:val="single" w:sz="4" w:color="000000"/>
+                  </w:tcBorders>
+                </w:tcPr>
+                <w:p>
+                  <w:pPr>
+                    <w:keepNext/>
+                    <w:keepLines/>
+                    <w:widowControl/>
+                    <w:spacing w:after="0" w:before="0"/>
+                    <w:ind w:left="0" w:right="0"/>
+                    <w:jc w:val="left"/>
+                  </w:pPr>
+                  <w:r>
+                    <w:rPr>
+                      <w:rFonts w:ascii="Arial" w:hAnsi="Arial" w:eastAsia="Arial" w:cs="Arial"/>
+                      <w:b w:val="0"/>
+                      <w:i w:val="0"/>
+                      <w:color w:val="000000"/>
+                      <w:sz w:val="16"/>
+                    </w:rPr>
+                    <w:t>Подпис</w:t>
+                  </w:r>
+                </w:p>
+                <w:p>
+                  <w:pPr>
+                    <w:keepLines/>
+                    <w:widowControl/>
+                    <w:spacing w:after="0"/>
+                    <w:ind w:left="0" w:right="0"/>
+                    <w:jc w:val="left"/>
+                  </w:pPr>
+                  <w:r>
+                    <w:rPr>
+                      <w:rFonts w:ascii="Arial" w:hAnsi="Arial" w:eastAsia="Arial" w:cs="Arial"/>
+                      <w:b w:val="0"/>
+                      <w:i w:val="0"/>
+                      <w:color w:val="000000"/>
+                      <w:sz w:val="16"/>
+                    </w:rPr>
+                    <w:t>________________</w:t>
+                  </w:r>
+                </w:p>
+              </w:tc>
+            </w:tr>
+          </w:tbl>
           <w:p>
             <w:pPr>
-              <w:widowControl/>
-              <w:spacing w:after="0"/>
-              <w:ind w:left="0" w:right="0"/>
-              <w:jc w:val="left"/>
+              <w:spacing w:after="0" w:before="0" w:line="20" w:lineRule="exact"/>
             </w:pPr>
             <w:r>
               <w:rPr>
-                <w:rFonts w:ascii="Arial" w:hAnsi="Arial" w:eastAsia="Arial" w:cs="Arial"/>
-                <w:b/>
-                <w:i w:val="0"/>
-                <w:color w:val="000000"/>
-                <w:sz w:val="16"/>
+                <w:sz w:val="2"/>
               </w:rPr>
-              <w:t>Съставител</w:t>
             </w:r>
           </w:p>
           <w:p>
             <w:pPr>
-              <w:widowControl/>
-              <w:spacing w:after="57"/>
-              <w:ind w:left="0" w:right="0"/>
-              <w:jc w:val="left"/>
+              <w:spacing w:after="0" w:before="0" w:line="20" w:lineRule="exact"/>
             </w:pPr>
             <w:r>
               <w:rPr>
-                <w:rFonts w:ascii="Arial" w:hAnsi="Arial" w:eastAsia="Arial" w:cs="Arial"/>
-                <w:b w:val="0"/>
-                <w:i w:val="0"/>
-                <w:color w:val="000000"/>
-                <w:sz w:val="18"/>
+                <w:sz w:val="2"/>
               </w:rPr>
-              <w:t>Синтетична проверка · PREPARER_NAME</w:t>
+            </w:r>
+            <w:r>
+              <w:rPr>
+                <w:sz w:val="2"/>
+              </w:rPr>
+            </w:r>
+          </w:p>
+          <w:tbl>
+            <w:tblPr>
+              <w:tblW w:type="auto" w:w="0"/>
+              <w:jc w:val="left"/>
+              <w:tblLayout w:type="fixed"/>
+              <w:tblLook w:firstColumn="1" w:firstRow="1" w:lastColumn="0" w:lastRow="0" w:noHBand="0" w:noVBand="1" w:val="04A0"/>
+              <w:tblBorders>
+                <w:top w:val="nil" w:sz="1" w:color="000000"/>
+                <w:left w:val="nil" w:sz="1" w:color="000000"/>
+                <w:bottom w:val="nil" w:sz="1" w:color="000000"/>
+                <w:right w:val="nil" w:sz="1" w:color="000000"/>
+                <w:insideH w:val="nil" w:sz="1" w:color="000000"/>
+                <w:insideV w:val="nil" w:sz="1" w:color="000000"/>
+              </w:tblBorders>
+            </w:tblPr>
+            <w:tblGrid>
+              <w:gridCol w:w="6928"/>
+              <w:gridCol w:w="3730"/>
+            </w:tblGrid>
+            <w:tr>
+              <w:trPr>
+                <w:trHeight w:val="0" w:hRule="atLeast"/>
+                <w:cantSplit/>
+              </w:trPr>
+              <w:tc>
+                <w:tcPr>
+                  <w:tcW w:type="dxa" w:w="6928"/>
+                  <w:vAlign w:val="center"/>
+                  <w:tcMar>
+                    <w:top w:w="68" w:type="dxa"/>
+                    <w:left w:w="68" w:type="dxa"/>
+                    <w:bottom w:w="68" w:type="dxa"/>
+                    <w:right w:w="68" w:type="dxa"/>
+                  </w:tcMar>
+                  <w:tcBorders>
+                    <w:top w:val="single" w:sz="4" w:color="000000"/>
+                    <w:left w:val="single" w:sz="4" w:color="000000"/>
+                    <w:bottom w:val="single" w:sz="4" w:color="000000"/>
+                    <w:right w:val="single" w:sz="4" w:color="000000"/>
+                  </w:tcBorders>
+                </w:tcPr>
+                <w:p>
+                  <w:pPr>
+                    <w:widowControl/>
+                    <w:spacing w:after="0"/>
+                    <w:ind w:left="0" w:right="0"/>
+                    <w:jc w:val="left"/>
+                  </w:pPr>
+                  <w:r>
+                    <w:rPr>
+                      <w:rFonts w:ascii="Arial" w:hAnsi="Arial" w:eastAsia="Arial" w:cs="Arial"/>
+                      <w:b/>
+                      <w:i w:val="0"/>
+                      <w:color w:val="000000"/>
+                      <w:sz w:val="16"/>
+                    </w:rPr>
+                    <w:t>Съставител</w:t>
+                  </w:r>
+                </w:p>
+                <w:p>
+                  <w:pPr>
+                    <w:widowControl/>
+                    <w:spacing w:after="57"/>
+                    <w:ind w:left="0" w:right="0"/>
+                    <w:jc w:val="left"/>
+                  </w:pPr>
+                  <w:r>
+                    <w:rPr>
+                      <w:rFonts w:ascii="Arial" w:hAnsi="Arial" w:eastAsia="Arial" w:cs="Arial"/>
+                      <w:b w:val="0"/>
+                      <w:i w:val="0"/>
+                      <w:color w:val="000000"/>
+                      <w:sz w:val="18"/>
+                    </w:rPr>
+                    <w:t>Синтетична проверка · PREPARER_NAME</w:t>
+                  </w:r>
+                </w:p>
+                <w:p>
+                  <w:pPr>
+                    <w:widowControl/>
+                    <w:spacing w:after="57"/>
+                    <w:ind w:left="0" w:right="0"/>
+                    <w:jc w:val="left"/>
+                  </w:pPr>
+                  <w:r>
+                    <w:rPr>
+                      <w:rFonts w:ascii="Arial" w:hAnsi="Arial" w:eastAsia="Arial" w:cs="Arial"/>
+                      <w:b w:val="0"/>
+                      <w:i w:val="0"/>
+                      <w:color w:val="000000"/>
+                      <w:sz w:val="18"/>
+                    </w:rPr>
+                    <w:t>Синтетична проверка · PREPARER_JOB_TITLE</w:t>
+                  </w:r>
+                </w:p>
+              </w:tc>
+              <w:tc>
+                <w:tcPr>
+                  <w:tcW w:type="dxa" w:w="3730"/>
+                  <w:vAlign w:val="center"/>
+                  <w:tcMar>
+                    <w:top w:w="68" w:type="dxa"/>
+                    <w:left w:w="68" w:type="dxa"/>
+                    <w:bottom w:w="68" w:type="dxa"/>
+                    <w:right w:w="68" w:type="dxa"/>
+                  </w:tcMar>
+                  <w:tcBorders>
+                    <w:top w:val="single" w:sz="4" w:color="000000"/>
+                    <w:left w:val="single" w:sz="4" w:color="000000"/>
+                    <w:bottom w:val="single" w:sz="4" w:color="000000"/>
+                    <w:right w:val="single" w:sz="4" w:color="000000"/>
+                  </w:tcBorders>
+                </w:tcPr>
+                <w:p>
+                  <w:pPr>
+                    <w:widowControl/>
+                    <w:spacing w:after="57"/>
+                    <w:ind w:left="0" w:right="0"/>
+                    <w:jc w:val="left"/>
+                  </w:pPr>
+                  <w:r>
+                    <w:rPr>
+                      <w:rFonts w:ascii="Arial" w:hAnsi="Arial" w:eastAsia="Arial" w:cs="Arial"/>
+                      <w:b w:val="0"/>
+                      <w:i w:val="0"/>
+                      <w:color w:val="000000"/>
+                      <w:sz w:val="18"/>
+                    </w:rPr>
+                    <w:t>Синтетична проверка · SIGNATURE_STATUS</w:t>
+                  </w:r>
+                </w:p>
+              </w:tc>
+            </w:tr>
+          </w:tbl>
+          <w:p>
+            <w:pPr>
+              <w:spacing w:after="0" w:before="0" w:line="20" w:lineRule="exact"/>
+            </w:pPr>
+            <w:r>
+              <w:rPr>
+                <w:sz w:val="2"/>
+              </w:rPr>
             </w:r>
           </w:p>
           <w:p>
             <w:pPr>
-              <w:widowControl/>
-              <w:spacing w:after="57"/>
-              <w:ind w:left="0" w:right="0"/>
-              <w:jc w:val="left"/>
+              <w:spacing w:after="0" w:before="0" w:line="20" w:lineRule="exact"/>
             </w:pPr>
             <w:r>
               <w:rPr>
-                <w:rFonts w:ascii="Arial" w:hAnsi="Arial" w:eastAsia="Arial" w:cs="Arial"/>
-                <w:b w:val="0"/>
-                <w:i w:val="0"/>
-                <w:color w:val="000000"/>
-                <w:sz w:val="18"/>
+                <w:sz w:val="2"/>
               </w:rPr>
-              <w:t>Синтетична проверка · PREPARER_JOB_TITLE</w:t>
             </w:r>
-          </w:p>
-        </w:tc>
-        <w:tc>
-          <w:tcPr>
-            <w:tcW w:type="dxa" w:w="3730"/>
-            <w:vAlign w:val="center"/>
-            <w:tcMar>
-              <w:top w:w="68" w:type="dxa"/>
-              <w:left w:w="68" w:type="dxa"/>
-              <w:bottom w:w="68" w:type="dxa"/>
-              <w:right w:w="68" w:type="dxa"/>
-            </w:tcMar>
-            <w:tcBorders>
-              <w:top w:val="single" w:sz="4" w:color="000000"/>
-              <w:left w:val="single" w:sz="4" w:color="000000"/>
-              <w:bottom w:val="single" w:sz="4" w:color="000000"/>
-              <w:right w:val="single" w:sz="4" w:color="000000"/>
-            </w:tcBorders>
-          </w:tcPr>
-          <w:p>
-            <w:pPr>
-              <w:widowControl/>
-              <w:spacing w:after="57"/>
-              <w:ind w:left="0" w:right="0"/>
-              <w:jc w:val="left"/>
-            </w:pPr>
             <w:r>
               <w:rPr>
-                <w:rFonts w:ascii="Arial" w:hAnsi="Arial" w:eastAsia="Arial" w:cs="Arial"/>
-                <w:b w:val="0"/>
-                <w:i w:val="0"/>
-                <w:color w:val="000000"/>
-                <w:sz w:val="18"/>
+                <w:sz w:val="2"/>
               </w:rPr>
-              <w:t>Синтетична проверка · SIGNATURE_STATUS</w:t>
             </w:r>
           </w:p>
         </w:tc>
@@ -2752,7 +2835,7 @@
           <w:r>
             <w:drawing>
               <wp:inline xmlns:a="http://schemas.openxmlformats.org/drawingml/2006/main" xmlns:pic="http://schemas.openxmlformats.org/drawingml/2006/picture">
-                <wp:extent cx="792000" cy="720000"/>
+                <wp:extent cx="792000" cy="264000"/>
                 <wp:docPr id="1" name="Picture 1"/>
                 <wp:cNvGraphicFramePr>
                   <a:graphicFrameLocks noChangeAspect="1"/>
@@ -2773,7 +2856,7 @@
                       <pic:spPr>
                         <a:xfrm>
                           <a:off x="0" y="0"/>
-                          <a:ext cx="792000" cy="720000"/>
+                          <a:ext cx="792000" cy="264000"/>
                         </a:xfrm>
                         <a:prstGeom prst="rect"/>
                       </pic:spPr>
@@ -2870,7 +2953,7 @@
           <w:r>
             <w:drawing>
               <wp:inline xmlns:a="http://schemas.openxmlformats.org/drawingml/2006/main" xmlns:pic="http://schemas.openxmlformats.org/drawingml/2006/picture">
-                <wp:extent cx="864000" cy="720000"/>
+                <wp:extent cx="864000" cy="288000"/>
                 <wp:docPr id="2" name="Picture 2"/>
                 <wp:cNvGraphicFramePr>
                   <a:graphicFrameLocks noChangeAspect="1"/>
@@ -2891,7 +2974,7 @@
                       <pic:spPr>
                         <a:xfrm>
                           <a:off x="0" y="0"/>
-                          <a:ext cx="864000" cy="720000"/>
+                          <a:ext cx="864000" cy="288000"/>
                         </a:xfrm>
                         <a:prstGeom prst="rect"/>
                       </pic:spPr>

</xml_diff>